<commit_message>
Remplace les tirets cadratins par une ponctuation adaptée
Site, README, commentaires et CV Word téléchargeable :
- titres : « Chambre 98 | CV interactif », « GenDon : plateforme… »,
  « Technicien Support Informatique (DSI) »
- dates : « 10 au 21 août 2026 », « 2021 - 2023 », « Depuis juin 2026 »
- films : « Logan, James Mangold (2017) », « Figurine de Rathalos
  (Monster Hunter Wilds) »…
- fenêtres de l'OS façon Windows : « a_propos.txt - Bloc-notes »
- puces : « Intitulé : texte »
L'original du CV Word reste dans _prive/ (ignoré par git).

Co-Authored-By: Claude Opus 5.5 <noreply@anthropic.com>
</commit_message>
<xml_diff>
--- a/assets/CV_Mehdi_PICHARD.docx
+++ b/assets/CV_Mehdi_PICHARD.docx
@@ -419,7 +419,7 @@
           <w:sz w:val="18"/>
           <w:szCs w:val="18"/>
         </w:rPr>
-        <w:t>GenDon — Plateforme de dons locaux entre particuliers à Gennevilliers</w:t>
+        <w:t>GenDon : plateforme de dons locaux entre particuliers à Gennevilliers</w:t>
       </w:r>
       <w:r>
         <w:rPr>
@@ -428,7 +428,7 @@
           <w:sz w:val="18"/>
           <w:szCs w:val="18"/>
         </w:rPr>
-        <w:t xml:space="preserve">  —  gendon.fr</w:t>
+        <w:t xml:space="preserve">  -  gendon.fr</w:t>
       </w:r>
       <w:r>
         <w:rPr>
@@ -439,7 +439,7 @@
           <w:sz w:val="18"/>
           <w:szCs w:val="18"/>
         </w:rPr>
-        <w:t xml:space="preserve">   (Juin 2026 – Aujourd'hui)</w:t>
+        <w:t xml:space="preserve">   (Depuis juin 2026)</w:t>
       </w:r>
     </w:p>
     <w:p>
@@ -572,7 +572,7 @@
           <w:sz w:val="18"/>
           <w:szCs w:val="18"/>
         </w:rPr>
-        <w:t>Technicien Support Informatique – DSI</w:t>
+        <w:t>Technicien Support Informatique (DSI)</w:t>
       </w:r>
       <w:r>
         <w:rPr>
@@ -592,7 +592,7 @@
           <w:sz w:val="18"/>
           <w:szCs w:val="18"/>
         </w:rPr>
-        <w:t xml:space="preserve">   (10 – 21 août 2026)</w:t>
+        <w:t xml:space="preserve">   (10 au 21 août 2026)</w:t>
       </w:r>
     </w:p>
     <w:p>
@@ -720,7 +720,7 @@
           <w:sz w:val="18"/>
           <w:szCs w:val="18"/>
         </w:rPr>
-        <w:t xml:space="preserve">   (2021 – 2023)</w:t>
+        <w:t xml:space="preserve">   (2021 - 2023)</w:t>
       </w:r>
     </w:p>
     <w:p>
@@ -872,7 +872,7 @@
           <w:sz w:val="18"/>
           <w:szCs w:val="18"/>
         </w:rPr>
-        <w:t xml:space="preserve">   (2021 – 2023)</w:t>
+        <w:t xml:space="preserve">   (2021 - 2023)</w:t>
       </w:r>
     </w:p>
     <w:p>
@@ -912,7 +912,7 @@
           <w:sz w:val="18"/>
           <w:szCs w:val="18"/>
         </w:rPr>
-        <w:t xml:space="preserve">   (2020 – 2021)</w:t>
+        <w:t xml:space="preserve">   (2020 - 2021)</w:t>
       </w:r>
     </w:p>
     <w:p>
@@ -952,7 +952,7 @@
           <w:sz w:val="18"/>
           <w:szCs w:val="18"/>
         </w:rPr>
-        <w:t xml:space="preserve">   (2018 – 2020)</w:t>
+        <w:t xml:space="preserve">   (2018 - 2020)</w:t>
       </w:r>
     </w:p>
     <w:p>

</xml_diff>